<commit_message>
docs(report): paper-style architecture figure (EN/ZH) with trust boundaries and formal verdict rule
One generator produces both languages from the same layout: untrusted
patch sources, trusted gate (policy, isolation boundary, observation
layer, verdict engine, evidence binding), human authority and delivery,
numbered flows and counterexample feedback. PNG for the report, vector
PDF for slides. Report figure 2 now uses the Chinese version.

Co-Authored-By: Claude Opus 5.5 <noreply@anthropic.com>
Claude-Session: https://claude.ai/code/session_01QLpURrvZrHPiytpZvyXweH
</commit_message>
<xml_diff>
--- a/docs/report-v2/out/credproof-report-v2-preview.docx
+++ b/docs/report-v2/out/credproof-report-v2-preview.docx
@@ -911,7 +911,7 @@
           <w:sz w:val="24"/>
         </w:rPr>
         <w:tab/>
-        <w:t>15</w:t>
+        <w:t>14</w:t>
       </w:r>
     </w:p>
     <w:p>
@@ -3739,7 +3739,7 @@
       <w:r>
         <w:drawing>
           <wp:inline xmlns:a="http://schemas.openxmlformats.org/drawingml/2006/main" xmlns:pic="http://schemas.openxmlformats.org/drawingml/2006/picture">
-            <wp:extent cx="5472000" cy="4883760"/>
+            <wp:extent cx="5472000" cy="3196800"/>
             <wp:docPr id="2" name="Picture 2"/>
             <wp:cNvGraphicFramePr>
               <a:graphicFrameLocks noChangeAspect="1"/>
@@ -3748,7 +3748,7 @@
               <a:graphicData uri="http://schemas.openxmlformats.org/drawingml/2006/picture">
                 <pic:pic>
                   <pic:nvPicPr>
-                    <pic:cNvPr id="0" name="architecture.png"/>
+                    <pic:cNvPr id="0" name="arch-zh.png"/>
                     <pic:cNvPicPr/>
                   </pic:nvPicPr>
                   <pic:blipFill>
@@ -3760,7 +3760,7 @@
                   <pic:spPr>
                     <a:xfrm>
                       <a:off x="0" y="0"/>
-                      <a:ext cx="5472000" cy="4883760"/>
+                      <a:ext cx="5472000" cy="3196800"/>
                     </a:xfrm>
                     <a:prstGeom prst="rect"/>
                   </pic:spPr>

</xml_diff>